<commit_message>
Tighten report to 6 pages; add team names, Devpost link, citation accuracy method/limitations
Co-Authored-By: Claude Fable 5 <noreply@anthropic.com>
</commit_message>
<xml_diff>
--- a/report/Final_Report.docx
+++ b/report/Final_Report.docx
@@ -4,7 +4,7 @@
   <w:body>
     <w:p>
       <w:pPr>
-        <w:spacing w:after="0" w:line="480"/>
+        <w:spacing w:after="0" w:line="360"/>
         <w:jc w:val="center"/>
       </w:pPr>
       <w:r>
@@ -20,7 +20,7 @@
     </w:p>
     <w:p>
       <w:pPr>
-        <w:spacing w:after="0" w:line="480"/>
+        <w:spacing w:after="0" w:line="360"/>
         <w:jc w:val="center"/>
       </w:pPr>
       <w:r>
@@ -29,12 +29,12 @@
           <w:sz w:val="24"/>
           <w:szCs w:val="24"/>
         </w:rPr>
-        <w:t xml:space="preserve">DS6051, Decoding Large Language Models. Hackathon Final Report.</w:t>
-      </w:r>
-    </w:p>
-    <w:p>
-      <w:pPr>
-        <w:spacing w:after="0" w:line="480"/>
+        <w:t xml:space="preserve">DS6051, Decoding Large Language Models. Hackathon Final Report. July 8, 2026.</w:t>
+      </w:r>
+    </w:p>
+    <w:p>
+      <w:pPr>
+        <w:spacing w:after="0" w:line="360"/>
         <w:jc w:val="center"/>
       </w:pPr>
       <w:r>
@@ -43,12 +43,12 @@
           <w:sz w:val="24"/>
           <w:szCs w:val="24"/>
         </w:rPr>
-        <w:t xml:space="preserve">July 8, 2026</w:t>
-      </w:r>
-    </w:p>
-    <w:p>
-      <w:pPr>
-        <w:spacing w:after="0" w:line="480"/>
+        <w:t xml:space="preserve">Team: Hudson Noyes, Ryan Dallas, Lino De Ros, Jackson Kennedy, Nathan Todd</w:t>
+      </w:r>
+    </w:p>
+    <w:p>
+      <w:pPr>
+        <w:spacing w:after="0" w:line="360"/>
         <w:jc w:val="center"/>
       </w:pPr>
       <w:r>
@@ -57,34 +57,9 @@
           <w:sz w:val="24"/>
           <w:szCs w:val="24"/>
         </w:rPr>
-        <w:t xml:space="preserve">Team: </w:t>
-      </w:r>
-      <w:r>
-        <w:rPr>
-          <w:rFonts w:ascii="Times New Roman" w:cs="Times New Roman" w:eastAsia="Times New Roman" w:hAnsi="Times New Roman"/>
-          <w:b/>
-          <w:bCs/>
-          <w:color w:val="C00000"/>
-          <w:sz w:val="24"/>
-          <w:szCs w:val="24"/>
-        </w:rPr>
-        <w:t xml:space="preserve">[TO FILL: team member names]</w:t>
-      </w:r>
-    </w:p>
-    <w:p>
-      <w:pPr>
-        <w:spacing w:after="0" w:line="480"/>
-        <w:jc w:val="center"/>
-      </w:pPr>
-      <w:r>
-        <w:rPr>
-          <w:rFonts w:ascii="Times New Roman" w:cs="Times New Roman" w:eastAsia="Times New Roman" w:hAnsi="Times New Roman"/>
-          <w:sz w:val="24"/>
-          <w:szCs w:val="24"/>
-        </w:rPr>
         <w:t xml:space="preserve">Code: </w:t>
       </w:r>
-      <w:hyperlink w:history="1" r:id="rIdna9hjgi0puqdghpwdaak3">
+      <w:hyperlink w:history="1" r:id="rIdhuvltgvj_jvctp6qpf-i0">
         <w:r>
           <w:rPr>
             <w:rStyle w:val="Hyperlink"/>
@@ -95,19 +70,38 @@
           <w:t xml:space="preserve">github.com/nathanctodd/legal-llm-metrics</w:t>
         </w:r>
       </w:hyperlink>
-    </w:p>
-    <w:p>
-      <w:pPr>
-        <w:spacing w:after="240" w:line="480"/>
-        <w:jc w:val="center"/>
-      </w:pPr>
       <w:r>
         <w:rPr>
           <w:rFonts w:ascii="Times New Roman" w:cs="Times New Roman" w:eastAsia="Times New Roman" w:hAnsi="Times New Roman"/>
           <w:sz w:val="24"/>
           <w:szCs w:val="24"/>
         </w:rPr>
-        <w:t xml:space="preserve">Devpost: </w:t>
+        <w:t xml:space="preserve">    Devpost: </w:t>
+      </w:r>
+      <w:hyperlink w:history="1" r:id="rIdgbrwt-tvbvmwyhyhkb_nu">
+        <w:r>
+          <w:rPr>
+            <w:rStyle w:val="Hyperlink"/>
+            <w:rFonts w:ascii="Times New Roman" w:cs="Times New Roman" w:eastAsia="Times New Roman" w:hAnsi="Times New Roman"/>
+            <w:sz w:val="24"/>
+            <w:szCs w:val="24"/>
+          </w:rPr>
+          <w:t xml:space="preserve">devpost.com/software/uva-decoding-llms-project</w:t>
+        </w:r>
+      </w:hyperlink>
+    </w:p>
+    <w:p>
+      <w:pPr>
+        <w:spacing w:after="160" w:line="360"/>
+        <w:jc w:val="center"/>
+      </w:pPr>
+      <w:r>
+        <w:rPr>
+          <w:rFonts w:ascii="Times New Roman" w:cs="Times New Roman" w:eastAsia="Times New Roman" w:hAnsi="Times New Roman"/>
+          <w:sz w:val="24"/>
+          <w:szCs w:val="24"/>
+        </w:rPr>
+        <w:t xml:space="preserve">Video: </w:t>
       </w:r>
       <w:r>
         <w:rPr>
@@ -118,32 +112,13 @@
           <w:sz w:val="24"/>
           <w:szCs w:val="24"/>
         </w:rPr>
-        <w:t xml:space="preserve">[TO FILL: Devpost link]</w:t>
-      </w:r>
-      <w:r>
-        <w:rPr>
-          <w:rFonts w:ascii="Times New Roman" w:cs="Times New Roman" w:eastAsia="Times New Roman" w:hAnsi="Times New Roman"/>
-          <w:sz w:val="24"/>
-          <w:szCs w:val="24"/>
-        </w:rPr>
-        <w:t xml:space="preserve">    Video: </w:t>
-      </w:r>
-      <w:r>
-        <w:rPr>
-          <w:rFonts w:ascii="Times New Roman" w:cs="Times New Roman" w:eastAsia="Times New Roman" w:hAnsi="Times New Roman"/>
-          <w:b/>
-          <w:bCs/>
-          <w:color w:val="C00000"/>
-          <w:sz w:val="24"/>
-          <w:szCs w:val="24"/>
-        </w:rPr>
         <w:t xml:space="preserve">[TO FILL: video link]</w:t>
       </w:r>
     </w:p>
     <w:p>
       <w:pPr>
         <w:pStyle w:val="Heading1"/>
-        <w:spacing w:after="120" w:before="240" w:line="480"/>
+        <w:spacing w:after="60" w:before="120" w:line="360"/>
       </w:pPr>
       <w:r>
         <w:rPr>
@@ -166,7 +141,7 @@
           <w:sz w:val="24"/>
           <w:szCs w:val="24"/>
         </w:rPr>
-        <w:t xml:space="preserve">This project treats a general-purpose open-weight language model as if it had been built and deployed as a consumer-facing legal AI assistant, and asks whether it is safe to deploy in that role. We evaluate two variants of the provided model, google/gemma-4-E2B (base) and google/gemma-4-E2B-it (instruction-tuned), against a safety scorecard designed for the legal domain. Following the assignment framing, the work answers three questions for each metric: what should we measure, why should we measure it, and how can we measure it, together with what each measurement cannot tell us. This is an evaluation exercise only; no model was fine-tuned or otherwise trained.</w:t>
+        <w:t xml:space="preserve">This project treats a general-purpose open-weight language model as if it had been built and deployed as a consumer-facing legal AI assistant, and asks whether it is safe to deploy in that role. We evaluate google/gemma-4-E2B (base) and google/gemma-4-E2B-it (instruction-tuned) against a five-metric safety scorecard built for the legal domain: factual consistency, sycophancy, calibration, cross-lingual safety distribution shift (our centerpiece), and citation accuracy. For each metric we answer what we measure, why, how, and what the measurement cannot tell us. This is an evaluation exercise only; no model was trained or fine-tuned. All automated metrics run on a fixed 100-question subset of MMLU professional_law translated into Spanish and Basque, a deliberately low-resource choice.</w:t>
       </w:r>
     </w:p>
     <w:p>
@@ -179,45 +154,13 @@
           <w:sz w:val="24"/>
           <w:szCs w:val="24"/>
         </w:rPr>
-        <w:t xml:space="preserve">Our scorecard contains five metrics chosen for the legal use-case: factual consistency, sycophancy, calibration, cross-lingual safety distribution shift (our centerpiece), and citation accuracy </w:t>
-      </w:r>
-      <w:r>
-        <w:rPr>
-          <w:rFonts w:ascii="Times New Roman" w:cs="Times New Roman" w:eastAsia="Times New Roman" w:hAnsi="Times New Roman"/>
-          <w:b/>
-          <w:bCs/>
-          <w:color w:val="C00000"/>
-          <w:sz w:val="24"/>
-          <w:szCs w:val="24"/>
-        </w:rPr>
-        <w:t xml:space="preserve">[TO FILL: citation accuracy status: results pending or scoped out; update]</w:t>
-      </w:r>
-      <w:r>
-        <w:rPr>
-          <w:rFonts w:ascii="Times New Roman" w:cs="Times New Roman" w:eastAsia="Times New Roman" w:hAnsi="Times New Roman"/>
-          <w:sz w:val="24"/>
-          <w:szCs w:val="24"/>
-        </w:rPr>
-        <w:t xml:space="preserve">. All automated metrics run on a fixed 100-question subset of MMLU professional_law, which we translated into Spanish and Basque to create a three-language paired benchmark. Basque was chosen deliberately as a low-resource language, per the assignment recommendation.</w:t>
-      </w:r>
-    </w:p>
-    <w:p>
-      <w:pPr>
-        <w:spacing w:after="0" w:line="480"/>
-      </w:pPr>
-      <w:r>
-        <w:rPr>
-          <w:rFonts w:ascii="Times New Roman" w:cs="Times New Roman" w:eastAsia="Times New Roman" w:hAnsi="Times New Roman"/>
-          <w:sz w:val="24"/>
-          <w:szCs w:val="24"/>
-        </w:rPr>
-        <w:t xml:space="preserve">Three findings lead the results. First, instruction tuning helps English competence but not safety: the instruction-tuned model answers 48% of English questions correctly versus 39% for the base model, yet its expected calibration error rises from 0.093 to 0.410, meaning its confidence signal becomes badly unreliable. Second, the instruction-tuned model is highly deferential under social pressure: when a user confidently asserts a wrong answer, it changes its answer 80% of the time. Third, and central to our scorecard, the instruction-tuned model's capability collapses in Basque: accuracy falls from 48% in English to 31% in Basque (a Language Parity Index of 0.646), landing below even the base model on the same items. Both models remain below 50% accuracy on bar-exam-style questions in every language, so neither is close to deployable as a legal assistant; the scorecard findings describe how they fail, not whether a marginal product could ship.</w:t>
+        <w:t xml:space="preserve">Three findings lead the results. First, instruction tuning helps English competence but not safety: accuracy rises from 39% to 48% while expected calibration error rises from 0.093 to 0.410. Second, the instruction-tuned model is highly deferential under social pressure, changing its answer 80% of the time when a user confidently asserts a wrong one. Third, its capability collapses in Basque, falling from 48% in English to 31% (Language Parity Index 0.646), below even the base model on identical items. Both models stay under 50% accuracy in every language; neither is close to deployable.</w:t>
       </w:r>
     </w:p>
     <w:p>
       <w:pPr>
         <w:pStyle w:val="Heading1"/>
-        <w:spacing w:after="120" w:before="240" w:line="480"/>
+        <w:spacing w:after="60" w:before="120" w:line="360"/>
       </w:pPr>
       <w:r>
         <w:rPr>
@@ -228,19 +171,6 @@
           <w:szCs w:val="28"/>
         </w:rPr>
         <w:t xml:space="preserve">2. Scorecard</w:t>
-      </w:r>
-    </w:p>
-    <w:p>
-      <w:pPr>
-        <w:spacing w:after="0" w:line="480"/>
-      </w:pPr>
-      <w:r>
-        <w:rPr>
-          <w:rFonts w:ascii="Times New Roman" w:cs="Times New Roman" w:eastAsia="Times New Roman" w:hAnsi="Times New Roman"/>
-          <w:sz w:val="24"/>
-          <w:szCs w:val="24"/>
-        </w:rPr>
-        <w:t xml:space="preserve">The table below is the complete scorecard in the assignment's required format. Results are for the instruction-tuned model (the variant a product would actually deploy) with the base model in parentheses where informative. Sections 4 and 5 give full results and discussion.</w:t>
       </w:r>
     </w:p>
     <w:tbl>
@@ -522,7 +452,7 @@
                 <w:sz w:val="20"/>
                 <w:szCs w:val="20"/>
               </w:rPr>
-              <w:t xml:space="preserve">A legal assistant that contradicts itself within a short conversation cannot be relied on; users act on its answers.</w:t>
+              <w:t xml:space="preserve">An assistant that contradicts itself within a conversation cannot be relied on; users act on its answers.</w:t>
             </w:r>
           </w:p>
         </w:tc>
@@ -554,7 +484,7 @@
                 <w:sz w:val="20"/>
                 <w:szCs w:val="20"/>
               </w:rPr>
-              <w:t xml:space="preserve">Automated multi-turn script on 100 MMLU professional_law items; compares answers across turns against gold labels.</w:t>
+              <w:t xml:space="preserve">Automated multi-turn script on the 100-item subset; answers compared across turns against gold labels.</w:t>
             </w:r>
           </w:p>
         </w:tc>
@@ -586,7 +516,7 @@
                 <w:sz w:val="20"/>
                 <w:szCs w:val="20"/>
               </w:rPr>
-              <w:t xml:space="preserve">Multiple-choice proxy; consistency does not imply correctness. A model that is consistently wrong scores well.</w:t>
+              <w:t xml:space="preserve">Multiple-choice proxy; a consistently wrong model still scores well.</w:t>
             </w:r>
           </w:p>
         </w:tc>
@@ -684,7 +614,7 @@
                 <w:sz w:val="20"/>
                 <w:szCs w:val="20"/>
               </w:rPr>
-              <w:t xml:space="preserve">Clients push back and misstate the law. A safe assistant must not adopt a user's confident but wrong legal claim.</w:t>
+              <w:t xml:space="preserve">Clients push back and misstate the law; a safe assistant must not adopt a confident but wrong user claim.</w:t>
             </w:r>
           </w:p>
         </w:tc>
@@ -748,7 +678,7 @@
                 <w:sz w:val="20"/>
                 <w:szCs w:val="20"/>
               </w:rPr>
-              <w:t xml:space="preserve">One pressure phrasing, one turn of pressure; does not capture hedging that stops short of a full flip.</w:t>
+              <w:t xml:space="preserve">One pressure phrasing and one turn; misses hedging that stops short of a full flip.</w:t>
             </w:r>
           </w:p>
         </w:tc>
@@ -846,7 +776,7 @@
                 <w:sz w:val="20"/>
                 <w:szCs w:val="20"/>
               </w:rPr>
-              <w:t xml:space="preserve">Deployment gating: the assistant must know when to defer to a human lawyer. Overconfident wrong answers are the dangerous failure mode.</w:t>
+              <w:t xml:space="preserve">The assistant must know when to defer to a human lawyer; overconfident wrong answers are the dangerous failure mode.</w:t>
             </w:r>
           </w:p>
         </w:tc>
@@ -878,7 +808,7 @@
                 <w:sz w:val="20"/>
                 <w:szCs w:val="20"/>
               </w:rPr>
-              <w:t xml:space="preserve">Automated: model confidence per answer compared against accuracy, summarized as expected calibration error (ECE).</w:t>
+              <w:t xml:space="preserve">Automated: per-answer confidence versus accuracy, summarized as expected calibration error (ECE).</w:t>
             </w:r>
           </w:p>
         </w:tc>
@@ -910,7 +840,7 @@
                 <w:sz w:val="20"/>
                 <w:szCs w:val="20"/>
               </w:rPr>
-              <w:t xml:space="preserve">Confidence measured on multiple-choice tokens, not the verbal confidence users actually see in prose answers.</w:t>
+              <w:t xml:space="preserve">Confidence measured on answer tokens, not the verbal confidence users see in prose.</w:t>
             </w:r>
           </w:p>
         </w:tc>
@@ -1008,7 +938,7 @@
                 <w:sz w:val="20"/>
                 <w:szCs w:val="20"/>
               </w:rPr>
-              <w:t xml:space="preserve">Equal access to justice: non-English speakers rely heavily on legal aid. Capability that silently collapses in a low-resource language is a safety failure for those users.</w:t>
+              <w:t xml:space="preserve">Equal access to justice: non-English speakers rely heavily on legal aid; capability that silently collapses in a low-resource language is a safety failure for those users.</w:t>
             </w:r>
           </w:p>
         </w:tc>
@@ -1040,7 +970,7 @@
                 <w:sz w:val="20"/>
                 <w:szCs w:val="20"/>
               </w:rPr>
-              <w:t xml:space="preserve">Automated: the same 100 items professionally paired across EN/ES/EU by id; accuracy compared per language; LPI = accuracy(language) / accuracy(English).</w:t>
+              <w:t xml:space="preserve">Automated: the same 100 items paired across EN/ES/EU by id; LPI = accuracy(language) / accuracy(English).</w:t>
             </w:r>
           </w:p>
         </w:tc>
@@ -1072,7 +1002,7 @@
                 <w:sz w:val="20"/>
                 <w:szCs w:val="20"/>
               </w:rPr>
-              <w:t xml:space="preserve">Measures a competence gap, not a refusal gap; translation artifacts may understate the true shift (see Section 6).</w:t>
+              <w:t xml:space="preserve">Competence gap, not a refusal gap; translation artifacts may understate the shift (Section 6).</w:t>
             </w:r>
           </w:p>
         </w:tc>
@@ -1171,7 +1101,7 @@
                 <w:sz w:val="20"/>
                 <w:szCs w:val="20"/>
               </w:rPr>
-              <w:t xml:space="preserve">Fabricated case citations are the canonical legal-AI failure; attorneys have been sanctioned for filing AI-invented cases. Confident false authority is worse than no answer.</w:t>
+              <w:t xml:space="preserve">Fabricated case citations are the canonical legal-AI failure; attorneys have been sanctioned for filing AI-invented cases.</w:t>
             </w:r>
           </w:p>
         </w:tc>
@@ -1198,13 +1128,12 @@
             <w:r>
               <w:rPr>
                 <w:rFonts w:ascii="Times New Roman" w:cs="Times New Roman" w:eastAsia="Times New Roman" w:hAnsi="Times New Roman"/>
-                <w:b/>
-                <w:bCs/>
-                <w:color w:val="C00000"/>
-                <w:sz w:val="24"/>
-                <w:szCs w:val="24"/>
-              </w:rPr>
-              <w:t xml:space="preserve">[TO FILL: method (planned: LLM-as-judge on whether cited cases/statutes exist and support the claim)]</w:t>
+                <w:b w:val="false"/>
+                <w:bCs w:val="false"/>
+                <w:sz w:val="20"/>
+                <w:szCs w:val="20"/>
+              </w:rPr>
+              <w:t xml:space="preserve">Measured across four conditions: a citation's existence (mitigating ghost citations), fidelity of quotations pulled directly from a citation, precision of each citation, and recall across all citations for a given response.</w:t>
             </w:r>
           </w:p>
         </w:tc>
@@ -1231,13 +1160,12 @@
             <w:r>
               <w:rPr>
                 <w:rFonts w:ascii="Times New Roman" w:cs="Times New Roman" w:eastAsia="Times New Roman" w:hAnsi="Times New Roman"/>
-                <w:b/>
-                <w:bCs/>
-                <w:color w:val="C00000"/>
-                <w:sz w:val="24"/>
-                <w:szCs w:val="24"/>
-              </w:rPr>
-              <w:t xml:space="preserve">[TO FILL: limitations (judge verifies plausibility, not existence in a legal database)]</w:t>
+                <w:b w:val="false"/>
+                <w:bCs w:val="false"/>
+                <w:sz w:val="20"/>
+                <w:szCs w:val="20"/>
+              </w:rPr>
+              <w:t xml:space="preserve">Convoluted process, can be computationally expensive.</w:t>
             </w:r>
           </w:p>
         </w:tc>
@@ -1245,7 +1173,7 @@
     </w:tbl>
     <w:p>
       <w:pPr>
-        <w:spacing w:after="200" w:before="80" w:line="240"/>
+        <w:spacing w:after="160" w:before="60" w:line="240"/>
       </w:pPr>
       <w:r>
         <w:rPr>
@@ -1255,13 +1183,13 @@
           <w:sz w:val="20"/>
           <w:szCs w:val="20"/>
         </w:rPr>
-        <w:t xml:space="preserve">Table 1. Safety scorecard for gemma-4-E2B-it evaluated as a legal assistant.</w:t>
+        <w:t xml:space="preserve">Table 1. Complete safety scorecard for gemma-4-E2B-it evaluated as a legal assistant, in the assignment's required format; base-model results in parentheses.</w:t>
       </w:r>
     </w:p>
     <w:p>
       <w:pPr>
         <w:pStyle w:val="Heading1"/>
-        <w:spacing w:after="120" w:before="240" w:line="480"/>
+        <w:spacing w:after="60" w:before="120" w:line="360"/>
       </w:pPr>
       <w:r>
         <w:rPr>
@@ -1277,7 +1205,7 @@
     <w:p>
       <w:pPr>
         <w:pStyle w:val="Heading2"/>
-        <w:spacing w:after="100" w:before="180" w:line="480"/>
+        <w:spacing w:after="40" w:before="80" w:line="360"/>
       </w:pPr>
       <w:r>
         <w:rPr>
@@ -1300,26 +1228,13 @@
           <w:sz w:val="24"/>
           <w:szCs w:val="24"/>
         </w:rPr>
-        <w:t xml:space="preserve">All automated metrics use MMLU professional_law, a bar-exam-style multiple-choice benchmark with ground-truth labels (question, four choices, one correct index). Our primary benchmark is a fixed 100-question subset drawn from the test split (shuffled with seed 42, first 100 items), which makes every run reproducible. As a robustness reference we also ran the full 1,534-question English test split; its results closely track the subset, indicating the subset is representative.</w:t>
-      </w:r>
-    </w:p>
-    <w:p>
-      <w:pPr>
-        <w:spacing w:after="0" w:line="480"/>
-      </w:pPr>
-      <w:r>
-        <w:rPr>
-          <w:rFonts w:ascii="Times New Roman" w:cs="Times New Roman" w:eastAsia="Times New Roman" w:hAnsi="Times New Roman"/>
-          <w:sz w:val="24"/>
-          <w:szCs w:val="24"/>
-        </w:rPr>
-        <w:t xml:space="preserve">For the cross-lingual metric, the 100-item subset was translated into Spanish and neutral standard Basque (euskara batua) using a consistency-controlled LLM translation pipeline with a fixed legal-terminology glossary, followed by a merge-time validation pass (paired ids, identical answer indices, harmonized terminology). United States common-law terms with no civil-law equivalent are rendered descriptively with the English term in parentheses on first use. The full methodology and every known caveat, including source-data typos and terminology decisions, is documented in data/TRANSLATION_NOTES.md in the repository.</w:t>
+        <w:t xml:space="preserve">All automated metrics use MMLU professional_law, a bar-exam-style multiple-choice benchmark with ground-truth labels. The primary benchmark is a fixed, reproducible 100-question subset of the test split (shuffled with seed 42, first 100 items); the full 1,534-question English split serves as a robustness reference. The subset was translated into Spanish and standard Basque with a consistency-controlled LLM translation pipeline using a fixed legal-terminology glossary, then validated at merge (paired ids, identical answer indices, harmonized terminology). Common-law terms with no civil-law equivalent carry the English in parentheses on first use; methodology and caveats are in data/TRANSLATION_NOTES.md.</w:t>
       </w:r>
     </w:p>
     <w:p>
       <w:pPr>
         <w:pStyle w:val="Heading2"/>
-        <w:spacing w:after="100" w:before="180" w:line="480"/>
+        <w:spacing w:after="40" w:before="80" w:line="360"/>
       </w:pPr>
       <w:r>
         <w:rPr>
@@ -1342,7 +1257,7 @@
           <w:sz w:val="24"/>
           <w:szCs w:val="24"/>
         </w:rPr>
-        <w:t xml:space="preserve">We evaluate google/gemma-4-E2B (base) and google/gemma-4-E2B-it (instruction-tuned). The base model receives plain-text prompts; the instruction-tuned model receives chat-formatted prompts via its chat template. </w:t>
+        <w:t xml:space="preserve">We evaluate google/gemma-4-E2B (base, plain-text prompts) and google/gemma-4-E2B-it (chat-formatted prompts via its chat template). </w:t>
       </w:r>
       <w:r>
         <w:rPr>
@@ -1353,7 +1268,7 @@
           <w:sz w:val="24"/>
           <w:szCs w:val="24"/>
         </w:rPr>
-        <w:t xml:space="preserve">[TO FILL: inference details: decoding parameters, confidence extraction method, hardware, runtime]</w:t>
+        <w:t xml:space="preserve">[TO FILL: inference details: decoding parameters, confidence extraction method, hardware]</w:t>
       </w:r>
       <w:r>
         <w:rPr>
@@ -1361,13 +1276,13 @@
           <w:sz w:val="24"/>
           <w:szCs w:val="24"/>
         </w:rPr>
-        <w:t xml:space="preserve"> Evaluation code is in the repository under code/ and the root notebook calibration_eval.ipynb.</w:t>
+        <w:t xml:space="preserve"> Evaluation code is in the repository under code/ and calibration_eval.ipynb.</w:t>
       </w:r>
     </w:p>
     <w:p>
       <w:pPr>
         <w:pStyle w:val="Heading2"/>
-        <w:spacing w:after="100" w:before="180" w:line="480"/>
+        <w:spacing w:after="40" w:before="80" w:line="360"/>
       </w:pPr>
       <w:r>
         <w:rPr>
@@ -1390,13 +1305,13 @@
           <w:sz w:val="24"/>
           <w:szCs w:val="24"/>
         </w:rPr>
-        <w:t xml:space="preserve">Each model answers all 100 questions in each language; predicted letters are scored against gold labels. Per-answer confidence is recorded alongside each prediction and summarized as expected calibration error (ECE), the gap between stated confidence and realized accuracy. The cross-lingual metric compares per-language accuracy on the paired items. We summarize the shift with a Language Parity Index (LPI), defined as accuracy in the target language divided by accuracy in English, so 1.0 is perfect parity; we propose LPI as our bonus metric in Section 7. Per-language plots (calibration curves, confidence distributions, accuracy by confidence, confusion matrices) are in results/Nathan_Results/.</w:t>
+        <w:t xml:space="preserve">Each model answers all 100 questions in each language; predicted letters are scored against gold labels, and per-answer confidence is summarized as expected calibration error (ECE), the gap between stated confidence and realized accuracy. Cross-lingual shift compares per-language accuracy on the paired items, summarized by the Language Parity Index (Section 7). Per-language plots are in results/Nathan_Results/.</w:t>
       </w:r>
     </w:p>
     <w:p>
       <w:pPr>
         <w:pStyle w:val="Heading2"/>
-        <w:spacing w:after="100" w:before="180" w:line="480"/>
+        <w:spacing w:after="40" w:before="80" w:line="360"/>
       </w:pPr>
       <w:r>
         <w:rPr>
@@ -1419,26 +1334,13 @@
           <w:sz w:val="24"/>
           <w:szCs w:val="24"/>
         </w:rPr>
-        <w:t xml:space="preserve">We use a scripted multi-turn evaluation. For each question, the model receives the question and four answer choices, and its first answer is recorded as the initial answer. The script then selects a known incorrect answer and presents it as a confident user challenge, for example: “I think the correct answer is B. Are you sure? Please correct yourself if needed.” The model's response to the challenge is recorded, and the model is then asked for a final answer only. Because MMLU has ground-truth labels, scoring is fully automated: the initial and final answer letters are compared against both the correct answer and the false user-suggested answer.</w:t>
-      </w:r>
-    </w:p>
-    <w:p>
-      <w:pPr>
-        <w:spacing w:after="0" w:line="480"/>
-      </w:pPr>
-      <w:r>
-        <w:rPr>
-          <w:rFonts w:ascii="Times New Roman" w:cs="Times New Roman" w:eastAsia="Times New Roman" w:hAnsi="Times New Roman"/>
-          <w:sz w:val="24"/>
-          <w:szCs w:val="24"/>
-        </w:rPr>
-        <w:t xml:space="preserve">This yields five interpretable measures: initial accuracy (did the model know the correct legal answer before pressure), final accuracy (did it still give the correct answer after pressure), challenge change rate (how often it changed its answer after the challenge), false adoption rate (how often the final answer matched the user's incorrect suggestion), and gold-to-false flip rate (how often it started correct and switched to the user's wrong answer).</w:t>
+        <w:t xml:space="preserve">We use a scripted multi-turn evaluation: the model answers a question (initial answer), is challenged with a known-incorrect answer framed as a confident user claim (for example, “I think the correct answer is B. Are you sure? Please correct yourself if needed.”), and is then asked for a final answer only. Because MMLU has gold labels, scoring is fully automated, yielding initial accuracy, final accuracy, challenge change rate, false adoption rate, and gold-to-false flip rate (started correct, switched to the user's wrong answer).</w:t>
       </w:r>
     </w:p>
     <w:p>
       <w:pPr>
         <w:pStyle w:val="Heading2"/>
-        <w:spacing w:after="100" w:before="180" w:line="480"/>
+        <w:spacing w:after="40" w:before="80" w:line="360"/>
       </w:pPr>
       <w:r>
         <w:rPr>
@@ -1464,13 +1366,13 @@
           <w:sz w:val="24"/>
           <w:szCs w:val="24"/>
         </w:rPr>
-        <w:t xml:space="preserve">[TO FILL: LLM-as-judge section: how ShieldGemma (or another judge) was used for citation accuracy or open-ended scoring, plus the assignment-required comparison of two additional judge models and their relative scores. Not yet in the repository.]</w:t>
+        <w:t xml:space="preserve">[TO FILL: how the judge was used for citation accuracy and open-ended scoring, plus the assignment-required comparison of two additional judge models and their relative scores]</w:t>
       </w:r>
     </w:p>
     <w:p>
       <w:pPr>
         <w:pStyle w:val="Heading1"/>
-        <w:spacing w:after="120" w:before="240" w:line="480"/>
+        <w:spacing w:after="60" w:before="120" w:line="360"/>
       </w:pPr>
       <w:r>
         <w:rPr>
@@ -1481,22 +1383,6 @@
           <w:szCs w:val="28"/>
         </w:rPr>
         <w:t xml:space="preserve">4. Results</w:t>
-      </w:r>
-    </w:p>
-    <w:p>
-      <w:pPr>
-        <w:pStyle w:val="Heading2"/>
-        <w:spacing w:after="100" w:before="180" w:line="480"/>
-      </w:pPr>
-      <w:r>
-        <w:rPr>
-          <w:rFonts w:ascii="Times New Roman" w:cs="Times New Roman" w:eastAsia="Times New Roman" w:hAnsi="Times New Roman"/>
-          <w:b/>
-          <w:bCs/>
-          <w:sz w:val="24"/>
-          <w:szCs w:val="24"/>
-        </w:rPr>
-        <w:t xml:space="preserve">4.1 Accuracy by language</w:t>
       </w:r>
     </w:p>
     <w:tbl>
@@ -2012,7 +1898,7 @@
     </w:tbl>
     <w:p>
       <w:pPr>
-        <w:spacing w:after="200" w:before="80" w:line="240"/>
+        <w:spacing w:after="160" w:before="60" w:line="240"/>
       </w:pPr>
       <w:r>
         <w:rPr>
@@ -2023,22 +1909,6 @@
           <w:szCs w:val="20"/>
         </w:rPr>
         <w:t xml:space="preserve">Table 2. Multiple-choice accuracy on MMLU professional_law. Chance is 25%.</w:t>
-      </w:r>
-    </w:p>
-    <w:p>
-      <w:pPr>
-        <w:pStyle w:val="Heading2"/>
-        <w:spacing w:after="100" w:before="180" w:line="480"/>
-      </w:pPr>
-      <w:r>
-        <w:rPr>
-          <w:rFonts w:ascii="Times New Roman" w:cs="Times New Roman" w:eastAsia="Times New Roman" w:hAnsi="Times New Roman"/>
-          <w:b/>
-          <w:bCs/>
-          <w:sz w:val="24"/>
-          <w:szCs w:val="24"/>
-        </w:rPr>
-        <w:t xml:space="preserve">4.2 Language Parity Index</w:t>
       </w:r>
     </w:p>
     <w:tbl>
@@ -2358,7 +2228,7 @@
     </w:tbl>
     <w:p>
       <w:pPr>
-        <w:spacing w:after="200" w:before="80" w:line="240"/>
+        <w:spacing w:after="160" w:before="60" w:line="240"/>
       </w:pPr>
       <w:r>
         <w:rPr>
@@ -2368,23 +2238,7 @@
           <w:sz w:val="20"/>
           <w:szCs w:val="20"/>
         </w:rPr>
-        <w:t xml:space="preserve">Table 3. LPI = accuracy(language) / accuracy(English), English baseline = 1.000. Computed on the paired 100-item subset.</w:t>
-      </w:r>
-    </w:p>
-    <w:p>
-      <w:pPr>
-        <w:pStyle w:val="Heading2"/>
-        <w:spacing w:after="100" w:before="180" w:line="480"/>
-      </w:pPr>
-      <w:r>
-        <w:rPr>
-          <w:rFonts w:ascii="Times New Roman" w:cs="Times New Roman" w:eastAsia="Times New Roman" w:hAnsi="Times New Roman"/>
-          <w:b/>
-          <w:bCs/>
-          <w:sz w:val="24"/>
-          <w:szCs w:val="24"/>
-        </w:rPr>
-        <w:t xml:space="preserve">4.3 Calibration</w:t>
+        <w:t xml:space="preserve">Table 3. LPI = accuracy(language) / accuracy(English), English baseline = 1.000. Paired 100-item subset.</w:t>
       </w:r>
     </w:p>
     <w:tbl>
@@ -2900,7 +2754,7 @@
     </w:tbl>
     <w:p>
       <w:pPr>
-        <w:spacing w:after="200" w:before="80" w:line="240"/>
+        <w:spacing w:after="160" w:before="60" w:line="240"/>
       </w:pPr>
       <w:r>
         <w:rPr>
@@ -2910,23 +2764,7 @@
           <w:sz w:val="20"/>
           <w:szCs w:val="20"/>
         </w:rPr>
-        <w:t xml:space="preserve">Table 4. Expected calibration error (ECE); lower is better. Calibration curves and confidence distributions are in results/Nathan_Results/Plots_*/.</w:t>
-      </w:r>
-    </w:p>
-    <w:p>
-      <w:pPr>
-        <w:pStyle w:val="Heading2"/>
-        <w:spacing w:after="100" w:before="180" w:line="480"/>
-      </w:pPr>
-      <w:r>
-        <w:rPr>
-          <w:rFonts w:ascii="Times New Roman" w:cs="Times New Roman" w:eastAsia="Times New Roman" w:hAnsi="Times New Roman"/>
-          <w:b/>
-          <w:bCs/>
-          <w:sz w:val="24"/>
-          <w:szCs w:val="24"/>
-        </w:rPr>
-        <w:t xml:space="preserve">4.4 Factual consistency and sycophancy</w:t>
+        <w:t xml:space="preserve">Table 4. Expected calibration error (ECE); lower is better. Plots in results/Nathan_Results/Plots_*/.</w:t>
       </w:r>
     </w:p>
     <w:tbl>
@@ -3540,7 +3378,7 @@
     </w:tbl>
     <w:p>
       <w:pPr>
-        <w:spacing w:after="200" w:before="80" w:line="240"/>
+        <w:spacing w:after="160" w:before="60" w:line="240"/>
       </w:pPr>
       <w:r>
         <w:rPr>
@@ -3550,21 +3388,248 @@
           <w:sz w:val="20"/>
           <w:szCs w:val="20"/>
         </w:rPr>
-        <w:t xml:space="preserve">Table 5. Multi-turn consistency and sycophancy results on the 100-item English subset.</w:t>
-      </w:r>
-    </w:p>
-    <w:p>
-      <w:pPr>
-        <w:spacing w:after="0" w:line="480"/>
-      </w:pPr>
-      <w:r>
-        <w:rPr>
-          <w:rFonts w:ascii="Times New Roman" w:cs="Times New Roman" w:eastAsia="Times New Roman" w:hAnsi="Times New Roman"/>
+        <w:t xml:space="preserve">Table 5. Multi-turn consistency and sycophancy on the 100-item English subset.</w:t>
+      </w:r>
+    </w:p>
+    <w:p>
+      <w:pPr>
+        <w:spacing w:after="160" w:line="240"/>
+      </w:pPr>
+      <w:r>
+        <w:rPr>
+          <w:rFonts w:ascii="Times New Roman" w:cs="Times New Roman" w:eastAsia="Times New Roman" w:hAnsi="Times New Roman"/>
+          <w:i/>
+          <w:iCs/>
+          <w:sz w:val="20"/>
+          <w:szCs w:val="20"/>
+        </w:rPr>
+        <w:t xml:space="preserve">Notes: </w:t>
+      </w:r>
+      <w:r>
+        <w:rPr>
+          <w:rFonts w:ascii="Times New Roman" w:cs="Times New Roman" w:eastAsia="Times New Roman" w:hAnsi="Times New Roman"/>
+          <w:b/>
+          <w:bCs/>
+          <w:color w:val="C00000"/>
+          <w:sz w:val="20"/>
+          <w:szCs w:val="20"/>
+        </w:rPr>
+        <w:t xml:space="preserve">[TO FILL: confirm definitions distinguishing the contradiction and challenge change columns, and where false adoption rate appears]</w:t>
+      </w:r>
+      <w:r>
+        <w:rPr>
+          <w:rFonts w:ascii="Times New Roman" w:cs="Times New Roman" w:eastAsia="Times New Roman" w:hAnsi="Times New Roman"/>
+          <w:i/>
+          <w:iCs/>
+          <w:sz w:val="20"/>
+          <w:szCs w:val="20"/>
+        </w:rPr>
+        <w:t xml:space="preserve">. Initial accuracy (44%) differs from Table 2 (48%) due to pipeline differences </w:t>
+      </w:r>
+      <w:r>
+        <w:rPr>
+          <w:rFonts w:ascii="Times New Roman" w:cs="Times New Roman" w:eastAsia="Times New Roman" w:hAnsi="Times New Roman"/>
+          <w:b/>
+          <w:bCs/>
+          <w:color w:val="C00000"/>
+          <w:sz w:val="20"/>
+          <w:szCs w:val="20"/>
+        </w:rPr>
+        <w:t xml:space="preserve">[TO FILL: confirm]</w:t>
+      </w:r>
+      <w:r>
+        <w:rPr>
+          <w:rFonts w:ascii="Times New Roman" w:cs="Times New Roman" w:eastAsia="Times New Roman" w:hAnsi="Times New Roman"/>
+          <w:i/>
+          <w:iCs/>
+          <w:sz w:val="20"/>
+          <w:szCs w:val="20"/>
+        </w:rPr>
+        <w:t xml:space="preserve">.</w:t>
+      </w:r>
+    </w:p>
+    <w:p>
+      <w:pPr>
+        <w:pStyle w:val="Heading1"/>
+        <w:spacing w:after="60" w:before="120" w:line="360"/>
+      </w:pPr>
+      <w:r>
+        <w:rPr>
+          <w:rFonts w:ascii="Times New Roman" w:cs="Times New Roman" w:eastAsia="Times New Roman" w:hAnsi="Times New Roman"/>
+          <w:b/>
+          <w:bCs/>
+          <w:sz w:val="28"/>
+          <w:szCs w:val="28"/>
+        </w:rPr>
+        <w:t xml:space="preserve">5. Discussion of Results</w:t>
+      </w:r>
+    </w:p>
+    <w:p>
+      <w:pPr>
+        <w:pStyle w:val="Heading2"/>
+        <w:spacing w:after="40" w:before="80" w:line="360"/>
+      </w:pPr>
+      <w:r>
+        <w:rPr>
+          <w:rFonts w:ascii="Times New Roman" w:cs="Times New Roman" w:eastAsia="Times New Roman" w:hAnsi="Times New Roman"/>
+          <w:b/>
+          <w:bCs/>
           <w:sz w:val="24"/>
           <w:szCs w:val="24"/>
         </w:rPr>
-        <w:t xml:space="preserve">Two notes on Table 5. First, </w:t>
-      </w:r>
+        <w:t xml:space="preserve">5.1 Cross-lingual shift</w:t>
+      </w:r>
+    </w:p>
+    <w:p>
+      <w:pPr>
+        <w:spacing w:after="0" w:line="480"/>
+      </w:pPr>
+      <w:r>
+        <w:rPr>
+          <w:rFonts w:ascii="Times New Roman" w:cs="Times New Roman" w:eastAsia="Times New Roman" w:hAnsi="Times New Roman"/>
+          <w:sz w:val="24"/>
+          <w:szCs w:val="24"/>
+        </w:rPr>
+        <w:t xml:space="preserve">The instruction-tuned model loses a third of its English capability in Basque (48% to 31%, LPI 0.646), landing below the base model on identical items, while Spanish holds up (45%, LPI 0.938). Instruction-tuning gains concentrate in high-resource languages: deployed multilingually, this assistant would silently serve Basque speakers a categorically worse product. The base model's near-flat profile (39/37/38%) is uniform weakness near the 25% chance floor, not robustness, which is why LPI must be read alongside absolute accuracy.</w:t>
+      </w:r>
+    </w:p>
+    <w:p>
+      <w:pPr>
+        <w:pStyle w:val="Heading2"/>
+        <w:spacing w:after="40" w:before="80" w:line="360"/>
+      </w:pPr>
+      <w:r>
+        <w:rPr>
+          <w:rFonts w:ascii="Times New Roman" w:cs="Times New Roman" w:eastAsia="Times New Roman" w:hAnsi="Times New Roman"/>
+          <w:b/>
+          <w:bCs/>
+          <w:sz w:val="24"/>
+          <w:szCs w:val="24"/>
+        </w:rPr>
+        <w:t xml:space="preserve">5.2 Calibration</w:t>
+      </w:r>
+    </w:p>
+    <w:p>
+      <w:pPr>
+        <w:spacing w:after="0" w:line="480"/>
+      </w:pPr>
+      <w:r>
+        <w:rPr>
+          <w:rFonts w:ascii="Times New Roman" w:cs="Times New Roman" w:eastAsia="Times New Roman" w:hAnsi="Times New Roman"/>
+          <w:sz w:val="24"/>
+          <w:szCs w:val="24"/>
+        </w:rPr>
+        <w:t xml:space="preserve">The base model is roughly calibrated (ECE 0.042 to 0.093) but weak; the instruction-tuned model is severely overconfident, with ECE near 0.41 in every language and 0.488 in Basque, worst exactly where accuracy is lowest. That is the dangerous quadrant: most confident where most wrong, so its confidence cannot gate escalation to a human lawyer without recalibration.</w:t>
+      </w:r>
+    </w:p>
+    <w:p>
+      <w:pPr>
+        <w:pStyle w:val="Heading2"/>
+        <w:spacing w:after="40" w:before="80" w:line="360"/>
+      </w:pPr>
+      <w:r>
+        <w:rPr>
+          <w:rFonts w:ascii="Times New Roman" w:cs="Times New Roman" w:eastAsia="Times New Roman" w:hAnsi="Times New Roman"/>
+          <w:b/>
+          <w:bCs/>
+          <w:sz w:val="24"/>
+          <w:szCs w:val="24"/>
+        </w:rPr>
+        <w:t xml:space="preserve">5.3 Sycophancy and consistency</w:t>
+      </w:r>
+    </w:p>
+    <w:p>
+      <w:pPr>
+        <w:spacing w:after="0" w:line="480"/>
+      </w:pPr>
+      <w:r>
+        <w:rPr>
+          <w:rFonts w:ascii="Times New Roman" w:cs="Times New Roman" w:eastAsia="Times New Roman" w:hAnsi="Times New Roman"/>
+          <w:sz w:val="24"/>
+          <w:szCs w:val="24"/>
+        </w:rPr>
+        <w:t xml:space="preserve">Under a single confident challenge, the instruction-tuned model changed its answer 80% of the time (base 22%) and flipped from correct to the user's wrong answer 12% of the time; both models lost three points of accuracy after pressure. Its low contradiction rate (6%) beside the very high change rate indicates a model that stays coherent within its final story but abandons its position when pushed: a client who confidently misstates the law will usually take the assistant with them. We tested one phrasing in one turn, and the format misses hedged capitulation that stops short of changing the letter. Throughout, both models sit below 50% accuracy (chance is 25%; the full 1,534-question run confirms the subset is representative): neither has the competence floor for legal advice, and the failures worsen selectively, in Basque, under pressure, and in confidence.</w:t>
+      </w:r>
+    </w:p>
+    <w:p>
+      <w:pPr>
+        <w:pStyle w:val="Heading1"/>
+        <w:spacing w:after="60" w:before="120" w:line="360"/>
+      </w:pPr>
+      <w:r>
+        <w:rPr>
+          <w:rFonts w:ascii="Times New Roman" w:cs="Times New Roman" w:eastAsia="Times New Roman" w:hAnsi="Times New Roman"/>
+          <w:b/>
+          <w:bCs/>
+          <w:sz w:val="28"/>
+          <w:szCs w:val="28"/>
+        </w:rPr>
+        <w:t xml:space="preserve">6. Limitations</w:t>
+      </w:r>
+    </w:p>
+    <w:p>
+      <w:pPr>
+        <w:pStyle w:val="ListParagraph"/>
+        <w:numPr>
+          <w:ilvl w:val="0"/>
+          <w:numId w:val="2"/>
+        </w:numPr>
+        <w:spacing w:after="60" w:line="240"/>
+      </w:pPr>
+      <w:r>
+        <w:rPr>
+          <w:rFonts w:ascii="Times New Roman" w:cs="Times New Roman" w:eastAsia="Times New Roman" w:hAnsi="Times New Roman"/>
+          <w:sz w:val="24"/>
+          <w:szCs w:val="24"/>
+        </w:rPr>
+        <w:t xml:space="preserve">Multiple-choice bar-exam questions measure legal knowledge recall, not open-ended advice, drafting, or citation behavior; and at 100 items per language, differences of a few points are within noise (the Basque collapse is far larger).</w:t>
+      </w:r>
+    </w:p>
+    <w:p>
+      <w:pPr>
+        <w:pStyle w:val="ListParagraph"/>
+        <w:numPr>
+          <w:ilvl w:val="0"/>
+          <w:numId w:val="2"/>
+        </w:numPr>
+        <w:spacing w:after="60" w:line="240"/>
+      </w:pPr>
+      <w:r>
+        <w:rPr>
+          <w:rFonts w:ascii="Times New Roman" w:cs="Times New Roman" w:eastAsia="Times New Roman" w:hAnsi="Times New Roman"/>
+          <w:sz w:val="24"/>
+          <w:szCs w:val="24"/>
+        </w:rPr>
+        <w:t xml:space="preserve">Translations were LLM-generated with glossary control and merge-time validation but not reviewed by native-speaker legal professionals; known caveats are logged in data/TRANSLATION_NOTES.md and likely make the Basque estimate conservative.</w:t>
+      </w:r>
+    </w:p>
+    <w:p>
+      <w:pPr>
+        <w:pStyle w:val="ListParagraph"/>
+        <w:numPr>
+          <w:ilvl w:val="0"/>
+          <w:numId w:val="2"/>
+        </w:numPr>
+        <w:spacing w:after="60" w:line="240"/>
+      </w:pPr>
+      <w:r>
+        <w:rPr>
+          <w:rFonts w:ascii="Times New Roman" w:cs="Times New Roman" w:eastAsia="Times New Roman" w:hAnsi="Times New Roman"/>
+          <w:sz w:val="24"/>
+          <w:szCs w:val="24"/>
+        </w:rPr>
+        <w:t xml:space="preserve">Sycophancy uses one scripted pressure pattern, and ECE uses answer-token confidence rather than the verbalized certainty users see.</w:t>
+      </w:r>
+    </w:p>
+    <w:p>
+      <w:pPr>
+        <w:pStyle w:val="ListParagraph"/>
+        <w:numPr>
+          <w:ilvl w:val="0"/>
+          <w:numId w:val="2"/>
+        </w:numPr>
+        <w:spacing w:after="60" w:line="240"/>
+      </w:pPr>
       <w:r>
         <w:rPr>
           <w:rFonts w:ascii="Times New Roman" w:cs="Times New Roman" w:eastAsia="Times New Roman" w:hAnsi="Times New Roman"/>
@@ -3574,40 +3639,13 @@
           <w:sz w:val="24"/>
           <w:szCs w:val="24"/>
         </w:rPr>
-        <w:t xml:space="preserve">[TO FILL: confirm with the metric owner: exact definitions distinguishing the contradiction rate and challenge change rate columns, and where the false adoption rate defined in Section 3.4 appears]</w:t>
-      </w:r>
-      <w:r>
-        <w:rPr>
-          <w:rFonts w:ascii="Times New Roman" w:cs="Times New Roman" w:eastAsia="Times New Roman" w:hAnsi="Times New Roman"/>
-          <w:sz w:val="24"/>
-          <w:szCs w:val="24"/>
-        </w:rPr>
-        <w:t xml:space="preserve">. Second, initial accuracy here (44% for the instruction-tuned model) differs slightly from the multiple-choice accuracy in Table 2 (48%) because the two pipelines elicit and parse answers differently; </w:t>
-      </w:r>
-      <w:r>
-        <w:rPr>
-          <w:rFonts w:ascii="Times New Roman" w:cs="Times New Roman" w:eastAsia="Times New Roman" w:hAnsi="Times New Roman"/>
-          <w:b/>
-          <w:bCs/>
-          <w:color w:val="C00000"/>
-          <w:sz w:val="24"/>
-          <w:szCs w:val="24"/>
-        </w:rPr>
-        <w:t xml:space="preserve">[TO FILL: confirm pipeline difference wording with owners]</w:t>
-      </w:r>
-      <w:r>
-        <w:rPr>
-          <w:rFonts w:ascii="Times New Roman" w:cs="Times New Roman" w:eastAsia="Times New Roman" w:hAnsi="Times New Roman"/>
-          <w:sz w:val="24"/>
-          <w:szCs w:val="24"/>
-        </w:rPr>
-        <w:t xml:space="preserve">.</w:t>
+        <w:t xml:space="preserve">[TO FILL: judge limitations once the LLM-as-judge section lands, including that Gemma-family judges evaluating Gemma outputs share training lineage]</w:t>
       </w:r>
     </w:p>
     <w:p>
       <w:pPr>
         <w:pStyle w:val="Heading1"/>
-        <w:spacing w:after="120" w:before="240" w:line="480"/>
+        <w:spacing w:after="60" w:before="120" w:line="360"/>
       </w:pPr>
       <w:r>
         <w:rPr>
@@ -3617,142 +3655,26 @@
           <w:sz w:val="28"/>
           <w:szCs w:val="28"/>
         </w:rPr>
-        <w:t xml:space="preserve">5. Discussion of Results</w:t>
-      </w:r>
-    </w:p>
-    <w:p>
-      <w:pPr>
-        <w:pStyle w:val="Heading2"/>
-        <w:spacing w:after="100" w:before="180" w:line="480"/>
-      </w:pPr>
-      <w:r>
-        <w:rPr>
-          <w:rFonts w:ascii="Times New Roman" w:cs="Times New Roman" w:eastAsia="Times New Roman" w:hAnsi="Times New Roman"/>
-          <w:b/>
-          <w:bCs/>
+        <w:t xml:space="preserve">7. Proposed Metric (Bonus): Language Parity Index</w:t>
+      </w:r>
+    </w:p>
+    <w:p>
+      <w:pPr>
+        <w:spacing w:after="0" w:line="480"/>
+      </w:pPr>
+      <w:r>
+        <w:rPr>
+          <w:rFonts w:ascii="Times New Roman" w:cs="Times New Roman" w:eastAsia="Times New Roman" w:hAnsi="Times New Roman"/>
           <w:sz w:val="24"/>
           <w:szCs w:val="24"/>
         </w:rPr>
-        <w:t xml:space="preserve">5.1 Cross-lingual shift: capability collapses in the low-resource language</w:t>
-      </w:r>
-    </w:p>
-    <w:p>
-      <w:pPr>
-        <w:spacing w:after="0" w:line="480"/>
-      </w:pPr>
-      <w:r>
-        <w:rPr>
-          <w:rFonts w:ascii="Times New Roman" w:cs="Times New Roman" w:eastAsia="Times New Roman" w:hAnsi="Times New Roman"/>
-          <w:sz w:val="24"/>
-          <w:szCs w:val="24"/>
-        </w:rPr>
-        <w:t xml:space="preserve">The instruction-tuned model loses about a third of its English capability in Basque: 48% falls to 31%, an LPI of 0.646, and lands below the base model's 38% on the identical items. Spanish holds up well (45%, LPI 0.938). The pattern suggests that the capability gains from instruction tuning are concentrated in high-resource languages and do not transfer to Basque. For deployment this is an equal-access problem: a multilingual legal assistant would silently serve Basque-speaking users a categorically worse product while presenting the same interface, and Section 5.2 shows it would do so with higher confidence.</w:t>
-      </w:r>
-    </w:p>
-    <w:p>
-      <w:pPr>
-        <w:spacing w:after="0" w:line="480"/>
-      </w:pPr>
-      <w:r>
-        <w:rPr>
-          <w:rFonts w:ascii="Times New Roman" w:cs="Times New Roman" w:eastAsia="Times New Roman" w:hAnsi="Times New Roman"/>
-          <w:sz w:val="24"/>
-          <w:szCs w:val="24"/>
-        </w:rPr>
-        <w:t xml:space="preserve">The base model's near-flat profile across languages (39/37/38%) deserves care rather than credit. Its Basque LPI of 0.974 looks like robustness, but the model is uniformly weak everywhere, only moderately above the 25% chance floor. This is exactly why LPI must be read together with absolute accuracy: parity between two bad numbers is not safety. What this metric cannot tell us: we measured an accuracy gap, not a refusal-rate gap, so the finding covers competence shift rather than the full safety alignment shift described in the assignment; and because some common-law terms carry English parentheticals in translation, the model can partially anchor on English text, which would understate the true gap.</w:t>
-      </w:r>
-    </w:p>
-    <w:p>
-      <w:pPr>
-        <w:pStyle w:val="Heading2"/>
-        <w:spacing w:after="100" w:before="180" w:line="480"/>
-      </w:pPr>
-      <w:r>
-        <w:rPr>
-          <w:rFonts w:ascii="Times New Roman" w:cs="Times New Roman" w:eastAsia="Times New Roman" w:hAnsi="Times New Roman"/>
-          <w:b/>
-          <w:bCs/>
-          <w:sz w:val="24"/>
-          <w:szCs w:val="24"/>
-        </w:rPr>
-        <w:t xml:space="preserve">5.2 Calibration: instruction tuning buys accuracy and pays in overconfidence</w:t>
-      </w:r>
-    </w:p>
-    <w:p>
-      <w:pPr>
-        <w:spacing w:after="0" w:line="480"/>
-      </w:pPr>
-      <w:r>
-        <w:rPr>
-          <w:rFonts w:ascii="Times New Roman" w:cs="Times New Roman" w:eastAsia="Times New Roman" w:hAnsi="Times New Roman"/>
-          <w:sz w:val="24"/>
-          <w:szCs w:val="24"/>
-        </w:rPr>
-        <w:t xml:space="preserve">The base model is reasonably calibrated (ECE between 0.042 and 0.093 across runs) but weak; the instruction-tuned model is more accurate and severely overconfident, with ECE around 0.41 in every language and 0.488 in Basque. The worst calibration occurs exactly where accuracy is lowest, which is the dangerous quadrant for a legal assistant: most confident where most wrong. Practically, this means the instruction-tuned model's confidence cannot be used as an escalation signal (for example, routing low-confidence questions to a human lawyer) without recalibration. The architectural caveat: we measure confidence over answer tokens in a multiple-choice format; the verbal confidence a user reads in a prose answer is a different signal and can diverge further.</w:t>
-      </w:r>
-    </w:p>
-    <w:p>
-      <w:pPr>
-        <w:pStyle w:val="Heading2"/>
-        <w:spacing w:after="100" w:before="180" w:line="480"/>
-      </w:pPr>
-      <w:r>
-        <w:rPr>
-          <w:rFonts w:ascii="Times New Roman" w:cs="Times New Roman" w:eastAsia="Times New Roman" w:hAnsi="Times New Roman"/>
-          <w:b/>
-          <w:bCs/>
-          <w:sz w:val="24"/>
-          <w:szCs w:val="24"/>
-        </w:rPr>
-        <w:t xml:space="preserve">5.3 Sycophancy and consistency: the aligned model is the agreeable one</w:t>
-      </w:r>
-    </w:p>
-    <w:p>
-      <w:pPr>
-        <w:spacing w:after="0" w:line="480"/>
-      </w:pPr>
-      <w:r>
-        <w:rPr>
-          <w:rFonts w:ascii="Times New Roman" w:cs="Times New Roman" w:eastAsia="Times New Roman" w:hAnsi="Times New Roman"/>
-          <w:sz w:val="24"/>
-          <w:szCs w:val="24"/>
-        </w:rPr>
-        <w:t xml:space="preserve">Under a single confident challenge from a user, the instruction-tuned model changed its answer 80% of the time, versus 22% for the base model, and flipped from a correct answer to the user's wrong answer 12% of the time. Both models lost three points of accuracy after pressure. The instruction-tuned model's low contradiction rate (6%) alongside its very high challenge change rate indicates a model that stays coherent within its final story but readily abandons its original position when pushed. For legal use this is a false-reassurance risk: a client who confidently misstates the law will usually take the assistant with them. What this cannot tell us: we tested one pressure phrasing in one turn; real users escalate, rephrase, and appeal to authority, and the multiple-choice format cannot capture hedged capitulation that stops short of changing the answer letter.</w:t>
-      </w:r>
-    </w:p>
-    <w:p>
-      <w:pPr>
-        <w:pStyle w:val="Heading2"/>
-        <w:spacing w:after="100" w:before="180" w:line="480"/>
-      </w:pPr>
-      <w:r>
-        <w:rPr>
-          <w:rFonts w:ascii="Times New Roman" w:cs="Times New Roman" w:eastAsia="Times New Roman" w:hAnsi="Times New Roman"/>
-          <w:b/>
-          <w:bCs/>
-          <w:sz w:val="24"/>
-          <w:szCs w:val="24"/>
-        </w:rPr>
-        <w:t xml:space="preserve">5.4 Overall capability context</w:t>
-      </w:r>
-    </w:p>
-    <w:p>
-      <w:pPr>
-        <w:spacing w:after="0" w:line="480"/>
-      </w:pPr>
-      <w:r>
-        <w:rPr>
-          <w:rFonts w:ascii="Times New Roman" w:cs="Times New Roman" w:eastAsia="Times New Roman" w:hAnsi="Times New Roman"/>
-          <w:sz w:val="24"/>
-          <w:szCs w:val="24"/>
-        </w:rPr>
-        <w:t xml:space="preserve">Every headline number sits below 50% accuracy on bar-exam-style questions, in every language, for both models (chance is 25%). The full 1,534-question English run (40.9% base, 45.6% instruction-tuned) confirms the subset is representative. Whatever the safety metrics say, neither model has the competence floor required for legal advice; the scorecard's value is in showing that the failure modes worsen selectively (in Basque, under pressure, and in confidence) rather than uniformly.</w:t>
+        <w:t xml:space="preserve">We propose the Language Parity Index, LPI(language) = accuracy(language) / accuracy(English), as a reusable metric for multilingual deployment: a dimensionless number encoding what fraction of the English-language product non-English users actually get. It has a failure mode our own results demonstrate: a uniformly weak model shows high parity (the base model reaches 0.974 in Basque while barely beating chance anywhere), so LPI must be reported with absolute accuracy and the chance baseline. A reasonable gate: LPI at or above 0.9 for every supported language, with English accuracy above a competence floor.</w:t>
       </w:r>
     </w:p>
     <w:p>
       <w:pPr>
         <w:pStyle w:val="Heading1"/>
-        <w:spacing w:after="120" w:before="240" w:line="480"/>
+        <w:spacing w:after="60" w:before="120" w:line="360"/>
       </w:pPr>
       <w:r>
         <w:rPr>
@@ -3762,17 +3684,12 @@
           <w:sz w:val="28"/>
           <w:szCs w:val="28"/>
         </w:rPr>
-        <w:t xml:space="preserve">6. Limitations</w:t>
-      </w:r>
-    </w:p>
-    <w:p>
-      <w:pPr>
-        <w:pStyle w:val="ListParagraph"/>
-        <w:numPr>
-          <w:ilvl w:val="0"/>
-          <w:numId w:val="2"/>
-        </w:numPr>
-        <w:spacing w:line="480"/>
+        <w:t xml:space="preserve">8. Conclusion and Deployment Recommendation</w:t>
+      </w:r>
+    </w:p>
+    <w:p>
+      <w:pPr>
+        <w:spacing w:after="0" w:line="480"/>
       </w:pPr>
       <w:r>
         <w:rPr>
@@ -3780,210 +3697,7 @@
           <w:sz w:val="24"/>
           <w:szCs w:val="24"/>
         </w:rPr>
-        <w:t xml:space="preserve">Benchmark proxy: multiple-choice bar-exam questions measure legal knowledge recall, not open-ended legal advice, drafting, or citation behavior.</w:t>
-      </w:r>
-    </w:p>
-    <w:p>
-      <w:pPr>
-        <w:pStyle w:val="ListParagraph"/>
-        <w:numPr>
-          <w:ilvl w:val="0"/>
-          <w:numId w:val="2"/>
-        </w:numPr>
-        <w:spacing w:line="480"/>
-      </w:pPr>
-      <w:r>
-        <w:rPr>
-          <w:rFonts w:ascii="Times New Roman" w:cs="Times New Roman" w:eastAsia="Times New Roman" w:hAnsi="Times New Roman"/>
-          <w:sz w:val="24"/>
-          <w:szCs w:val="24"/>
-        </w:rPr>
-        <w:t xml:space="preserve">Sample size: the paired benchmark is 100 items per language; small differences (a few percentage points) are within noise, though the Basque collapse is far larger than that.</w:t>
-      </w:r>
-    </w:p>
-    <w:p>
-      <w:pPr>
-        <w:pStyle w:val="ListParagraph"/>
-        <w:numPr>
-          <w:ilvl w:val="0"/>
-          <w:numId w:val="2"/>
-        </w:numPr>
-        <w:spacing w:line="480"/>
-      </w:pPr>
-      <w:r>
-        <w:rPr>
-          <w:rFonts w:ascii="Times New Roman" w:cs="Times New Roman" w:eastAsia="Times New Roman" w:hAnsi="Times New Roman"/>
-          <w:sz w:val="24"/>
-          <w:szCs w:val="24"/>
-        </w:rPr>
-        <w:t xml:space="preserve">Translation pipeline: translations were LLM-generated with glossary control and validation, but were not reviewed by native-speaker legal professionals. Known caveats, including English parentheticals for untranslatable common-law terms and cleaned source typos, are logged in data/TRANSLATION_NOTES.md; the parentheticals likely make our Basque shift estimate conservative.</w:t>
-      </w:r>
-    </w:p>
-    <w:p>
-      <w:pPr>
-        <w:pStyle w:val="ListParagraph"/>
-        <w:numPr>
-          <w:ilvl w:val="0"/>
-          <w:numId w:val="2"/>
-        </w:numPr>
-        <w:spacing w:line="480"/>
-      </w:pPr>
-      <w:r>
-        <w:rPr>
-          <w:rFonts w:ascii="Times New Roman" w:cs="Times New Roman" w:eastAsia="Times New Roman" w:hAnsi="Times New Roman"/>
-          <w:sz w:val="24"/>
-          <w:szCs w:val="24"/>
-        </w:rPr>
-        <w:t xml:space="preserve">Sycophancy design: one scripted pressure pattern; adoption of the user's specific wrong answer versus a different wrong answer is only partly separable in the current metric set.</w:t>
-      </w:r>
-    </w:p>
-    <w:p>
-      <w:pPr>
-        <w:pStyle w:val="ListParagraph"/>
-        <w:numPr>
-          <w:ilvl w:val="0"/>
-          <w:numId w:val="2"/>
-        </w:numPr>
-        <w:spacing w:line="480"/>
-      </w:pPr>
-      <w:r>
-        <w:rPr>
-          <w:rFonts w:ascii="Times New Roman" w:cs="Times New Roman" w:eastAsia="Times New Roman" w:hAnsi="Times New Roman"/>
-          <w:sz w:val="24"/>
-          <w:szCs w:val="24"/>
-        </w:rPr>
-        <w:t xml:space="preserve">Confidence signal: ECE is computed from answer-token confidence in a forced-choice format, not from the verbalized certainty users would see.</w:t>
-      </w:r>
-    </w:p>
-    <w:p>
-      <w:pPr>
-        <w:pStyle w:val="ListParagraph"/>
-        <w:numPr>
-          <w:ilvl w:val="0"/>
-          <w:numId w:val="2"/>
-        </w:numPr>
-        <w:spacing w:line="480"/>
-      </w:pPr>
-      <w:r>
-        <w:rPr>
-          <w:rFonts w:ascii="Times New Roman" w:cs="Times New Roman" w:eastAsia="Times New Roman" w:hAnsi="Times New Roman"/>
-          <w:b/>
-          <w:bCs/>
-          <w:color w:val="C00000"/>
-          <w:sz w:val="24"/>
-          <w:szCs w:val="24"/>
-        </w:rPr>
-        <w:t xml:space="preserve">[TO FILL: judge limitations once the LLM-as-judge sections land, including that Gemma-family judges evaluating Gemma outputs share training lineage]</w:t>
-      </w:r>
-    </w:p>
-    <w:p>
-      <w:pPr>
-        <w:pStyle w:val="Heading1"/>
-        <w:spacing w:after="120" w:before="240" w:line="480"/>
-      </w:pPr>
-      <w:r>
-        <w:rPr>
-          <w:rFonts w:ascii="Times New Roman" w:cs="Times New Roman" w:eastAsia="Times New Roman" w:hAnsi="Times New Roman"/>
-          <w:b/>
-          <w:bCs/>
-          <w:sz w:val="28"/>
-          <w:szCs w:val="28"/>
-        </w:rPr>
-        <w:t xml:space="preserve">7. Proposed Metric (Bonus): Language Parity Index</w:t>
-      </w:r>
-    </w:p>
-    <w:p>
-      <w:pPr>
-        <w:spacing w:after="0" w:line="480"/>
-      </w:pPr>
-      <w:r>
-        <w:rPr>
-          <w:rFonts w:ascii="Times New Roman" w:cs="Times New Roman" w:eastAsia="Times New Roman" w:hAnsi="Times New Roman"/>
-          <w:sz w:val="24"/>
-          <w:szCs w:val="24"/>
-        </w:rPr>
-        <w:t xml:space="preserve">We propose the Language Parity Index as a reusable safety metric for multilingual deployment: LPI(language) = accuracy(language) / accuracy(English baseline). It is dimensionless, comparable across models and datasets, and directly encodes the deployment question: what fraction of the English-language product are non-English users actually getting? In our results it cleanly separates a healthy language (Spanish, 0.938) from a collapsed one (Basque, 0.646).</w:t>
-      </w:r>
-    </w:p>
-    <w:p>
-      <w:pPr>
-        <w:spacing w:after="0" w:line="480"/>
-      </w:pPr>
-      <w:r>
-        <w:rPr>
-          <w:rFonts w:ascii="Times New Roman" w:cs="Times New Roman" w:eastAsia="Times New Roman" w:hAnsi="Times New Roman"/>
-          <w:sz w:val="24"/>
-          <w:szCs w:val="24"/>
-        </w:rPr>
-        <w:t xml:space="preserve">LPI has a failure mode our own results demonstrate: a uniformly weak model shows high parity (the base model reaches 0.974 in Basque while barely beating chance anywhere). We therefore specify that LPI must be reported alongside absolute accuracy and the chance baseline, and is only meaningful when the English baseline is materially above chance. A deployment gate might read: LPI at or above 0.9 for every supported language, with English accuracy above an absolute competence floor.</w:t>
-      </w:r>
-    </w:p>
-    <w:p>
-      <w:pPr>
-        <w:pStyle w:val="Heading1"/>
-        <w:spacing w:after="120" w:before="240" w:line="480"/>
-      </w:pPr>
-      <w:r>
-        <w:rPr>
-          <w:rFonts w:ascii="Times New Roman" w:cs="Times New Roman" w:eastAsia="Times New Roman" w:hAnsi="Times New Roman"/>
-          <w:b/>
-          <w:bCs/>
-          <w:sz w:val="28"/>
-          <w:szCs w:val="28"/>
-        </w:rPr>
-        <w:t xml:space="preserve">8. Conclusion and Deployment Recommendation</w:t>
-      </w:r>
-    </w:p>
-    <w:p>
-      <w:pPr>
-        <w:spacing w:after="0" w:line="480"/>
-      </w:pPr>
-      <w:r>
-        <w:rPr>
-          <w:rFonts w:ascii="Times New Roman" w:cs="Times New Roman" w:eastAsia="Times New Roman" w:hAnsi="Times New Roman"/>
-          <w:sz w:val="24"/>
-          <w:szCs w:val="24"/>
-        </w:rPr>
-        <w:t xml:space="preserve">Treated as a legal AI assistant, gemma-4-E2B-it fails the scorecard on three independent axes: it cannot be trusted about its own uncertainty (ECE 0.410), it cannot hold a correct position against a confidently wrong user (80% challenge change rate), and its capability silently collapses for Basque speakers (LPI 0.646). The base model avoids the overconfidence and sycophancy failures but lacks the competence to be useful. Our recommendation is that neither variant should be deployed as a legal assistant in any language. If a system were built around models of this class, the scorecard implies three launch gates: recalibrated or externally-verified confidence before any escalation logic, adversarial pressure testing on multi-turn conversations, and per-language parity requirements so that adding a language is treated as a safety decision, not a localization checkbox.</w:t>
-      </w:r>
-    </w:p>
-    <w:p>
-      <w:pPr>
-        <w:spacing w:after="120" w:line="240"/>
-      </w:pPr>
-    </w:p>
-    <w:p>
-      <w:pPr>
-        <w:spacing w:after="0" w:line="480"/>
-      </w:pPr>
-      <w:r>
-        <w:rPr>
-          <w:rFonts w:ascii="Times New Roman" w:cs="Times New Roman" w:eastAsia="Times New Roman" w:hAnsi="Times New Roman"/>
-          <w:b/>
-          <w:bCs/>
-          <w:sz w:val="24"/>
-          <w:szCs w:val="24"/>
-        </w:rPr>
-        <w:t xml:space="preserve">Repository: </w:t>
-      </w:r>
-      <w:hyperlink w:history="1" r:id="rIdlxi8xz6fhouojay1n8cck">
-        <w:r>
-          <w:rPr>
-            <w:rStyle w:val="Hyperlink"/>
-            <w:rFonts w:ascii="Times New Roman" w:cs="Times New Roman" w:eastAsia="Times New Roman" w:hAnsi="Times New Roman"/>
-            <w:sz w:val="24"/>
-            <w:szCs w:val="24"/>
-          </w:rPr>
-          <w:t xml:space="preserve">https://github.com/nathanctodd/legal-llm-metrics</w:t>
-        </w:r>
-      </w:hyperlink>
-      <w:r>
-        <w:rPr>
-          <w:rFonts w:ascii="Times New Roman" w:cs="Times New Roman" w:eastAsia="Times New Roman" w:hAnsi="Times New Roman"/>
-          <w:sz w:val="24"/>
-          <w:szCs w:val="24"/>
-        </w:rPr>
-        <w:t xml:space="preserve">. Data: data/subset_100_{en,es,eu}.json and data/TRANSLATION_NOTES.md. Code: code/ and calibration_eval.ipynb. Raw outputs and plots: results/.</w:t>
+        <w:t xml:space="preserve">Treated as a legal AI assistant, gemma-4-E2B-it fails the scorecard on three independent axes: unreliable confidence (ECE 0.410), capitulation to confidently wrong users (80% challenge change rate), and silent capability collapse for Basque speakers (LPI 0.646). Neither variant should be deployed as a legal assistant in any language. Any successor system needs three launch gates: recalibrated confidence before escalation logic, adversarial multi-turn pressure testing, and per-language parity requirements, making each added language a safety decision, not a localization checkbox.</w:t>
       </w:r>
     </w:p>
     <w:sectPr>
@@ -4376,7 +4090,7 @@
     <w:next w:val="Normal"/>
     <w:qFormat/>
     <w:pPr>
-      <w:spacing w:after="120" w:before="240"/>
+      <w:spacing w:after="60" w:before="120"/>
       <w:outlineLvl w:val="0"/>
     </w:pPr>
     <w:rPr>
@@ -4394,7 +4108,7 @@
     <w:next w:val="Normal"/>
     <w:qFormat/>
     <w:pPr>
-      <w:spacing w:after="100" w:before="180"/>
+      <w:spacing w:after="40" w:before="80"/>
       <w:outlineLvl w:val="1"/>
     </w:pPr>
     <w:rPr>

</xml_diff>

<commit_message>
Finalize report: judge section (Qwen 3B vs 7B), TruthfulQA dataset, citation results, 5.4 citation discussion
Co-Authored-By: Claude Fable 5 <noreply@anthropic.com>
</commit_message>
<xml_diff>
--- a/report/Final_Report.docx
+++ b/report/Final_Report.docx
@@ -48,7 +48,7 @@
     </w:p>
     <w:p>
       <w:pPr>
-        <w:spacing w:after="0" w:line="360"/>
+        <w:spacing w:after="160" w:line="360"/>
         <w:jc w:val="center"/>
       </w:pPr>
       <w:r>
@@ -59,7 +59,7 @@
         </w:rPr>
         <w:t xml:space="preserve">Code: </w:t>
       </w:r>
-      <w:hyperlink w:history="1" r:id="rIdhuvltgvj_jvctp6qpf-i0">
+      <w:hyperlink w:history="1" r:id="rIdnosddjtbzzyya1ixmebks">
         <w:r>
           <w:rPr>
             <w:rStyle w:val="Hyperlink"/>
@@ -78,7 +78,7 @@
         </w:rPr>
         <w:t xml:space="preserve">    Devpost: </w:t>
       </w:r>
-      <w:hyperlink w:history="1" r:id="rIdgbrwt-tvbvmwyhyhkb_nu">
+      <w:hyperlink w:history="1" r:id="rIdno6v4hxubtmsriuegr1cm">
         <w:r>
           <w:rPr>
             <w:rStyle w:val="Hyperlink"/>
@@ -89,19 +89,13 @@
           <w:t xml:space="preserve">devpost.com/software/uva-decoding-llms-project</w:t>
         </w:r>
       </w:hyperlink>
-    </w:p>
-    <w:p>
-      <w:pPr>
-        <w:spacing w:after="160" w:line="360"/>
-        <w:jc w:val="center"/>
-      </w:pPr>
       <w:r>
         <w:rPr>
           <w:rFonts w:ascii="Times New Roman" w:cs="Times New Roman" w:eastAsia="Times New Roman" w:hAnsi="Times New Roman"/>
           <w:sz w:val="24"/>
           <w:szCs w:val="24"/>
         </w:rPr>
-        <w:t xml:space="preserve">Video: </w:t>
+        <w:t xml:space="preserve">    Video: </w:t>
       </w:r>
       <w:r>
         <w:rPr>
@@ -141,7 +135,7 @@
           <w:sz w:val="24"/>
           <w:szCs w:val="24"/>
         </w:rPr>
-        <w:t xml:space="preserve">This project treats a general-purpose open-weight language model as if it had been built and deployed as a consumer-facing legal AI assistant, and asks whether it is safe to deploy in that role. We evaluate google/gemma-4-E2B (base) and google/gemma-4-E2B-it (instruction-tuned) against a five-metric safety scorecard built for the legal domain: factual consistency, sycophancy, calibration, cross-lingual safety distribution shift (our centerpiece), and citation accuracy. For each metric we answer what we measure, why, how, and what the measurement cannot tell us. This is an evaluation exercise only; no model was trained or fine-tuned. All automated metrics run on a fixed 100-question subset of MMLU professional_law translated into Spanish and Basque, a deliberately low-resource choice.</w:t>
+        <w:t xml:space="preserve">This project treats a general-purpose open-weight language model as if it had been built and deployed as a consumer-facing legal AI assistant, and asks whether it is safe to deploy in that role. We evaluate google/gemma-4-E2B (base) and google/gemma-4-E2B-it (instruction-tuned) against a five-metric safety scorecard built for the legal domain: factual consistency, sycophancy, calibration, cross-lingual safety distribution shift, and citation accuracy. This is an evaluation exercise only; no model was trained or fine-tuned. Most metrics run on a fixed 100-question subset of MMLU professional_law translated into Spanish and Basque; judge-scored metrics use the 64-question Law slice of TruthfulQA.</w:t>
       </w:r>
     </w:p>
     <w:p>
@@ -938,7 +932,7 @@
                 <w:sz w:val="20"/>
                 <w:szCs w:val="20"/>
               </w:rPr>
-              <w:t xml:space="preserve">Equal access to justice: non-English speakers rely heavily on legal aid; capability that silently collapses in a low-resource language is a safety failure for those users.</w:t>
+              <w:t xml:space="preserve">Non-English speakers rely heavily on legal aid; capability that silently collapses in a low-resource language is a safety failure for those users.</w:t>
             </w:r>
           </w:p>
         </w:tc>
@@ -1063,13 +1057,12 @@
             <w:r>
               <w:rPr>
                 <w:rFonts w:ascii="Times New Roman" w:cs="Times New Roman" w:eastAsia="Times New Roman" w:hAnsi="Times New Roman"/>
-                <w:b/>
-                <w:bCs/>
-                <w:color w:val="C00000"/>
-                <w:sz w:val="24"/>
-                <w:szCs w:val="24"/>
-              </w:rPr>
-              <w:t xml:space="preserve">[TO FILL: result]</w:t>
+                <w:b w:val="false"/>
+                <w:bCs w:val="false"/>
+                <w:sz w:val="20"/>
+                <w:szCs w:val="20"/>
+              </w:rPr>
+              <w:t xml:space="preserve">Attach rate 43/102 claims; all 9 verifiable citations real; corpus recall 0.42</w:t>
             </w:r>
           </w:p>
         </w:tc>
@@ -1173,7 +1166,7 @@
     </w:tbl>
     <w:p>
       <w:pPr>
-        <w:spacing w:after="160" w:before="60" w:line="240"/>
+        <w:spacing w:after="100" w:before="60" w:line="240"/>
       </w:pPr>
       <w:r>
         <w:rPr>
@@ -1228,7 +1221,7 @@
           <w:sz w:val="24"/>
           <w:szCs w:val="24"/>
         </w:rPr>
-        <w:t xml:space="preserve">All automated metrics use MMLU professional_law, a bar-exam-style multiple-choice benchmark with ground-truth labels. The primary benchmark is a fixed, reproducible 100-question subset of the test split (shuffled with seed 42, first 100 items); the full 1,534-question English split serves as a robustness reference. The subset was translated into Spanish and standard Basque with a consistency-controlled LLM translation pipeline using a fixed legal-terminology glossary, then validated at merge (paired ids, identical answer indices, harmonized terminology). Common-law terms with no civil-law equivalent carry the English in parentheses on first use; methodology and caveats are in data/TRANSLATION_NOTES.md.</w:t>
+        <w:t xml:space="preserve">All automated metrics use MMLU professional_law, a bar-exam-style multiple-choice benchmark with ground-truth labels. The primary benchmark is a fixed, reproducible 100-question subset of the test split (shuffled with seed 42, first 100 items); the full 1,534-question English split serves as a robustness reference. The subset was translated into Spanish and standard Basque with a consistency-controlled LLM translation pipeline using a fixed legal-terminology glossary, then validated at merge (paired ids, identical answer indices, harmonized terminology). Common-law terms with no civil-law equivalent carry the English in parentheses on first use; caveats are in data/TRANSLATION_NOTES.md. Judge-scored metrics (citation accuracy and a verbalized-confidence calibration study) use the 64-question Law slice of TruthfulQA, an adversarial benchmark with reference answers, built to elicit confident falsehoods.</w:t>
       </w:r>
     </w:p>
     <w:p>
@@ -1276,7 +1269,7 @@
           <w:sz w:val="24"/>
           <w:szCs w:val="24"/>
         </w:rPr>
-        <w:t xml:space="preserve"> Evaluation code is in the repository under code/ and calibration_eval.ipynb.</w:t>
+        <w:t xml:space="preserve"> Code is under code/ and calibration_eval.ipynb.</w:t>
       </w:r>
     </w:p>
     <w:p>
@@ -1305,7 +1298,7 @@
           <w:sz w:val="24"/>
           <w:szCs w:val="24"/>
         </w:rPr>
-        <w:t xml:space="preserve">Each model answers all 100 questions in each language; predicted letters are scored against gold labels, and per-answer confidence is summarized as expected calibration error (ECE), the gap between stated confidence and realized accuracy. Cross-lingual shift compares per-language accuracy on the paired items, summarized by the Language Parity Index (Section 7). Per-language plots are in results/Nathan_Results/.</w:t>
+        <w:t xml:space="preserve">Each model answers all 100 questions per language; predictions are scored against gold labels and per-answer confidence is summarized as expected calibration error (ECE). Cross-lingual shift compares per-language accuracy on the paired items via the Language Parity Index (Section 7).</w:t>
       </w:r>
     </w:p>
     <w:p>
@@ -1334,7 +1327,7 @@
           <w:sz w:val="24"/>
           <w:szCs w:val="24"/>
         </w:rPr>
-        <w:t xml:space="preserve">We use a scripted multi-turn evaluation: the model answers a question (initial answer), is challenged with a known-incorrect answer framed as a confident user claim (for example, “I think the correct answer is B. Are you sure? Please correct yourself if needed.”), and is then asked for a final answer only. Because MMLU has gold labels, scoring is fully automated, yielding initial accuracy, final accuracy, challenge change rate, false adoption rate, and gold-to-false flip rate (started correct, switched to the user's wrong answer).</w:t>
+        <w:t xml:space="preserve">We use a scripted multi-turn evaluation: the model answers a question (initial answer), is challenged with a known-incorrect answer framed as a confident user claim, and is then asked for a final answer only. Because MMLU has gold labels, scoring is fully automated, yielding initial accuracy, final accuracy, challenge change rate, false adoption rate, and gold-to-false flip rate (started correct, switched to the user's wrong answer).</w:t>
       </w:r>
     </w:p>
     <w:p>
@@ -1357,6 +1350,14 @@
       <w:pPr>
         <w:spacing w:after="0" w:line="480"/>
       </w:pPr>
+      <w:r>
+        <w:rPr>
+          <w:rFonts w:ascii="Times New Roman" w:cs="Times New Roman" w:eastAsia="Times New Roman" w:hAnsi="Times New Roman"/>
+          <w:sz w:val="24"/>
+          <w:szCs w:val="24"/>
+        </w:rPr>
+        <w:t xml:space="preserve">For open-ended outputs, a separate judge grades correctness so the model under test never grades itself: Qwen2.5-7B-Instruct receives the question, the model's answer, and TruthfulQA's reference correct and incorrect answers, and returns a truthful verdict read from Yes/No token logits. In the companion calibration study on this slice, the model self-reports a 1-10 confidence per answer, scored against judge-graded accuracy as ECE </w:t>
+      </w:r>
       <w:r>
         <w:rPr>
           <w:rFonts w:ascii="Times New Roman" w:cs="Times New Roman" w:eastAsia="Times New Roman" w:hAnsi="Times New Roman"/>
@@ -1366,7 +1367,34 @@
           <w:sz w:val="24"/>
           <w:szCs w:val="24"/>
         </w:rPr>
-        <w:t xml:space="preserve">[TO FILL: how the judge was used for citation accuracy and open-ended scoring, plus the assignment-required comparison of two additional judge models and their relative scores]</w:t>
+        <w:t xml:space="preserve">[TO FILL: ECE and overconfidence-gap numbers from the TruthfulQA run]</w:t>
+      </w:r>
+      <w:r>
+        <w:rPr>
+          <w:rFonts w:ascii="Times New Roman" w:cs="Times New Roman" w:eastAsia="Times New Roman" w:hAnsi="Times New Roman"/>
+          <w:sz w:val="24"/>
+          <w:szCs w:val="24"/>
+        </w:rPr>
+        <w:t xml:space="preserve">. Per the assignment we compared judges: an earlier run used Qwen2.5-3B-Instruct, and moving to the 7B judge produced a large jump in graded accuracy </w:t>
+      </w:r>
+      <w:r>
+        <w:rPr>
+          <w:rFonts w:ascii="Times New Roman" w:cs="Times New Roman" w:eastAsia="Times New Roman" w:hAnsi="Times New Roman"/>
+          <w:b/>
+          <w:bCs/>
+          <w:color w:val="C00000"/>
+          <w:sz w:val="24"/>
+          <w:szCs w:val="24"/>
+        </w:rPr>
+        <w:t xml:space="preserve">[TO FILL: 3B vs 7B scores]</w:t>
+      </w:r>
+      <w:r>
+        <w:rPr>
+          <w:rFonts w:ascii="Times New Roman" w:cs="Times New Roman" w:eastAsia="Times New Roman" w:hAnsi="Times New Roman"/>
+          <w:sz w:val="24"/>
+          <w:szCs w:val="24"/>
+        </w:rPr>
+        <w:t xml:space="preserve">, implying the LLM-as-judge is semi-reliable and model-dependent.</w:t>
       </w:r>
     </w:p>
     <w:p>
@@ -1898,7 +1926,7 @@
     </w:tbl>
     <w:p>
       <w:pPr>
-        <w:spacing w:after="160" w:before="60" w:line="240"/>
+        <w:spacing w:after="100" w:before="60" w:line="240"/>
       </w:pPr>
       <w:r>
         <w:rPr>
@@ -2228,7 +2256,7 @@
     </w:tbl>
     <w:p>
       <w:pPr>
-        <w:spacing w:after="160" w:before="60" w:line="240"/>
+        <w:spacing w:after="100" w:before="60" w:line="240"/>
       </w:pPr>
       <w:r>
         <w:rPr>
@@ -2754,7 +2782,7 @@
     </w:tbl>
     <w:p>
       <w:pPr>
-        <w:spacing w:after="160" w:before="60" w:line="240"/>
+        <w:spacing w:after="100" w:before="60" w:line="240"/>
       </w:pPr>
       <w:r>
         <w:rPr>
@@ -3378,7 +3406,7 @@
     </w:tbl>
     <w:p>
       <w:pPr>
-        <w:spacing w:after="160" w:before="60" w:line="240"/>
+        <w:spacing w:after="100" w:before="60" w:line="240"/>
       </w:pPr>
       <w:r>
         <w:rPr>
@@ -3490,7 +3518,7 @@
           <w:sz w:val="24"/>
           <w:szCs w:val="24"/>
         </w:rPr>
-        <w:t xml:space="preserve">The instruction-tuned model loses a third of its English capability in Basque (48% to 31%, LPI 0.646), landing below the base model on identical items, while Spanish holds up (45%, LPI 0.938). Instruction-tuning gains concentrate in high-resource languages: deployed multilingually, this assistant would silently serve Basque speakers a categorically worse product. The base model's near-flat profile (39/37/38%) is uniform weakness near the 25% chance floor, not robustness, which is why LPI must be read alongside absolute accuracy.</w:t>
+        <w:t xml:space="preserve">The instruction-tuned model loses a third of its English capability in Basque (48% to 31%, LPI 0.646), landing below the base model on identical items, while Spanish holds up (45%, LPI 0.938): instruction-tuning gains concentrate in high-resource languages, so a multilingual deployment would silently serve Basque speakers a categorically worse product. The base model's near-flat profile (39/37/38%) is uniform weakness near the 25% chance floor, not robustness.</w:t>
       </w:r>
     </w:p>
     <w:p>
@@ -3519,7 +3547,7 @@
           <w:sz w:val="24"/>
           <w:szCs w:val="24"/>
         </w:rPr>
-        <w:t xml:space="preserve">The base model is roughly calibrated (ECE 0.042 to 0.093) but weak; the instruction-tuned model is severely overconfident, with ECE near 0.41 in every language and 0.488 in Basque, worst exactly where accuracy is lowest. That is the dangerous quadrant: most confident where most wrong, so its confidence cannot gate escalation to a human lawyer without recalibration.</w:t>
+        <w:t xml:space="preserve">The base model is roughly calibrated (ECE 0.042 to 0.093) but weak; the instruction-tuned model is severely overconfident, with ECE near 0.41 in every language and 0.488 in Basque, worst exactly where accuracy is lowest: most confident where most wrong, so its confidence cannot gate escalation to a human lawyer without recalibration.</w:t>
       </w:r>
     </w:p>
     <w:p>
@@ -3548,7 +3576,36 @@
           <w:sz w:val="24"/>
           <w:szCs w:val="24"/>
         </w:rPr>
-        <w:t xml:space="preserve">Under a single confident challenge, the instruction-tuned model changed its answer 80% of the time (base 22%) and flipped from correct to the user's wrong answer 12% of the time; both models lost three points of accuracy after pressure. Its low contradiction rate (6%) beside the very high change rate indicates a model that stays coherent within its final story but abandons its position when pushed: a client who confidently misstates the law will usually take the assistant with them. We tested one phrasing in one turn, and the format misses hedged capitulation that stops short of changing the letter. Throughout, both models sit below 50% accuracy (chance is 25%; the full 1,534-question run confirms the subset is representative): neither has the competence floor for legal advice, and the failures worsen selectively, in Basque, under pressure, and in confidence.</w:t>
+        <w:t xml:space="preserve">Under a single confident challenge, the instruction-tuned model changed its answer 80% of the time (base 22%) and flipped from correct to the user's wrong answer 12% of the time; both models lost three points of accuracy after pressure. The low contradiction rate (6%) beside the very high change rate shows a model that stays coherent but abandons its position when pushed: a client who confidently misstates the law usually takes the assistant with them. (We tested one phrasing in one turn; the format misses hedged capitulation.) Throughout, both models sit below 50% accuracy (chance is 25%): neither has the competence floor for legal advice, and the failures worsen selectively, in Basque, under pressure, and in confidence.</w:t>
+      </w:r>
+    </w:p>
+    <w:p>
+      <w:pPr>
+        <w:pStyle w:val="Heading2"/>
+        <w:spacing w:after="40" w:before="80" w:line="360"/>
+      </w:pPr>
+      <w:r>
+        <w:rPr>
+          <w:rFonts w:ascii="Times New Roman" w:cs="Times New Roman" w:eastAsia="Times New Roman" w:hAnsi="Times New Roman"/>
+          <w:b/>
+          <w:bCs/>
+          <w:sz w:val="24"/>
+          <w:szCs w:val="24"/>
+        </w:rPr>
+        <w:t xml:space="preserve">5.4 Citation behavior</w:t>
+      </w:r>
+    </w:p>
+    <w:p>
+      <w:pPr>
+        <w:spacing w:after="0" w:line="480"/>
+      </w:pPr>
+      <w:r>
+        <w:rPr>
+          <w:rFonts w:ascii="Times New Roman" w:cs="Times New Roman" w:eastAsia="Times New Roman" w:hAnsi="Times New Roman"/>
+          <w:sz w:val="24"/>
+          <w:szCs w:val="24"/>
+        </w:rPr>
+        <w:t xml:space="preserve">The model attached a citation to only 43 of 102 claims (corpus recall 0.42); all nine verifiable citations resolved to real authorities (four case-law, five U.S.C.), so the dominant failure at this scale is under-citation rather than fabricated authority. The other 34 named instruments are unverifiable by design, and nine verifiable citations are too few to certify the model never fabricates case law.</w:t>
       </w:r>
     </w:p>
     <w:p>
@@ -3582,7 +3639,7 @@
           <w:sz w:val="24"/>
           <w:szCs w:val="24"/>
         </w:rPr>
-        <w:t xml:space="preserve">Multiple-choice bar-exam questions measure legal knowledge recall, not open-ended advice, drafting, or citation behavior; and at 100 items per language, differences of a few points are within noise (the Basque collapse is far larger).</w:t>
+        <w:t xml:space="preserve">Multiple-choice bar-exam questions measure knowledge recall, not open-ended advice or drafting; at 100 items per language, few-point differences are within noise (the Basque collapse is far larger).</w:t>
       </w:r>
     </w:p>
     <w:p>
@@ -3600,7 +3657,7 @@
           <w:sz w:val="24"/>
           <w:szCs w:val="24"/>
         </w:rPr>
-        <w:t xml:space="preserve">Translations were LLM-generated with glossary control and merge-time validation but not reviewed by native-speaker legal professionals; known caveats are logged in data/TRANSLATION_NOTES.md and likely make the Basque estimate conservative.</w:t>
+        <w:t xml:space="preserve">Translations were LLM-generated with glossary control and validation but not reviewed by native speakers; caveats in data/TRANSLATION_NOTES.md likely make the Basque estimate conservative.</w:t>
       </w:r>
     </w:p>
     <w:p>
@@ -3633,13 +3690,10 @@
       <w:r>
         <w:rPr>
           <w:rFonts w:ascii="Times New Roman" w:cs="Times New Roman" w:eastAsia="Times New Roman" w:hAnsi="Times New Roman"/>
-          <w:b/>
-          <w:bCs/>
-          <w:color w:val="C00000"/>
           <w:sz w:val="24"/>
           <w:szCs w:val="24"/>
         </w:rPr>
-        <w:t xml:space="preserve">[TO FILL: judge limitations once the LLM-as-judge section lands, including that Gemma-family judges evaluating Gemma outputs share training lineage]</w:t>
+        <w:t xml:space="preserve">Judge-graded metrics inherit judge error: graded accuracy jumped materially between Qwen2.5-3B and 7B judges, so results are judge-dependent; on TruthfulQA, self-reported confidence clusters on round values and n = 64 makes ECE noisy.</w:t>
       </w:r>
     </w:p>
     <w:p>
@@ -3668,7 +3722,7 @@
           <w:sz w:val="24"/>
           <w:szCs w:val="24"/>
         </w:rPr>
-        <w:t xml:space="preserve">We propose the Language Parity Index, LPI(language) = accuracy(language) / accuracy(English), as a reusable metric for multilingual deployment: a dimensionless number encoding what fraction of the English-language product non-English users actually get. It has a failure mode our own results demonstrate: a uniformly weak model shows high parity (the base model reaches 0.974 in Basque while barely beating chance anywhere), so LPI must be reported with absolute accuracy and the chance baseline. A reasonable gate: LPI at or above 0.9 for every supported language, with English accuracy above a competence floor.</w:t>
+        <w:t xml:space="preserve">We propose the Language Parity Index, LPI(language) = accuracy(language) / accuracy(English), as a reusable metric for multilingual deployment: a dimensionless number encoding what fraction of the English-language product non-English users actually get. Its failure mode appears in our own results: a uniformly weak model shows high parity (base model, 0.974 in Basque while barely beating chance), so LPI must be reported with absolute accuracy and the chance baseline. A reasonable gate: LPI at or above 0.9 for every supported language, with English accuracy above a competence floor.</w:t>
       </w:r>
     </w:p>
     <w:p>
@@ -3697,7 +3751,7 @@
           <w:sz w:val="24"/>
           <w:szCs w:val="24"/>
         </w:rPr>
-        <w:t xml:space="preserve">Treated as a legal AI assistant, gemma-4-E2B-it fails the scorecard on three independent axes: unreliable confidence (ECE 0.410), capitulation to confidently wrong users (80% challenge change rate), and silent capability collapse for Basque speakers (LPI 0.646). Neither variant should be deployed as a legal assistant in any language. Any successor system needs three launch gates: recalibrated confidence before escalation logic, adversarial multi-turn pressure testing, and per-language parity requirements, making each added language a safety decision, not a localization checkbox.</w:t>
+        <w:t xml:space="preserve">Treated as a legal AI assistant, gemma-4-E2B-it fails the scorecard on three independent axes: unreliable confidence (ECE 0.410), capitulation to confidently wrong users (80% challenge change rate), and silent capability collapse for Basque speakers (LPI 0.646). Neither variant should be deployed in any language. Any successor system needs three launch gates: recalibrated confidence before escalation logic, adversarial multi-turn pressure testing, and per-language parity requirements, making each added language a safety decision, not a localization checkbox.</w:t>
       </w:r>
     </w:p>
     <w:sectPr>

</xml_diff>